<commit_message>
feat: add email verification, password reset, user management in admin panel, fix 49 bugs, add IDEF0 and ER diagrams, update documentation
</commit_message>
<xml_diff>
--- a/Пояснительная_записка.docx
+++ b/Пояснительная_записка.docx
@@ -5324,178 +5324,140 @@
           <w:sz w:val="28"/>
           <w:szCs w:val="28"/>
         </w:rPr>
-        <w:t xml:space="preserve">Для хранения данных приложения используется Firebase Firestore — облачная NoSQL база данных.</w:t>
-      </w:r>
-    </w:p>
-    <w:p>
-      <w:pPr>
-        <w:spacing w:after="0" w:before="0" w:line="360"/>
-        <w:ind w:left="283" w:right="283" w:firstLine="708"/>
-        <w:jc w:val="both"/>
-      </w:pPr>
-      <w:r>
-        <w:rPr>
-          <w:rFonts w:ascii="Times New Roman" w:cs="Times New Roman" w:eastAsia="Times New Roman" w:hAnsi="Times New Roman"/>
-          <w:b w:val="false"/>
-          <w:bCs w:val="false"/>
-          <w:i w:val="false"/>
-          <w:iCs w:val="false"/>
-          <w:sz w:val="28"/>
-          <w:szCs w:val="28"/>
-        </w:rPr>
-        <w:t xml:space="preserve">Концептуальная модель описывает сущности и связи между ними:</w:t>
-      </w:r>
-    </w:p>
-    <w:p>
-      <w:pPr>
-        <w:spacing w:after="0" w:before="0" w:line="360"/>
-        <w:ind w:left="283" w:right="283" w:firstLine="708"/>
-        <w:jc w:val="both"/>
-      </w:pPr>
-      <w:r>
-        <w:rPr>
-          <w:rFonts w:ascii="Times New Roman" w:cs="Times New Roman" w:eastAsia="Times New Roman" w:hAnsi="Times New Roman"/>
-          <w:b w:val="false"/>
-          <w:bCs w:val="false"/>
-          <w:i w:val="false"/>
-          <w:iCs w:val="false"/>
-          <w:sz w:val="28"/>
-          <w:szCs w:val="28"/>
-        </w:rPr>
-        <w:t xml:space="preserve">– User (пользователь) — хранит данные аутентификации;</w:t>
-      </w:r>
-    </w:p>
-    <w:p>
-      <w:pPr>
-        <w:spacing w:after="0" w:before="0" w:line="360"/>
-        <w:ind w:left="283" w:right="283" w:firstLine="708"/>
-        <w:jc w:val="both"/>
-      </w:pPr>
-      <w:r>
-        <w:rPr>
-          <w:rFonts w:ascii="Times New Roman" w:cs="Times New Roman" w:eastAsia="Times New Roman" w:hAnsi="Times New Roman"/>
-          <w:b w:val="false"/>
-          <w:bCs w:val="false"/>
-          <w:i w:val="false"/>
-          <w:iCs w:val="false"/>
-          <w:sz w:val="28"/>
-          <w:szCs w:val="28"/>
-        </w:rPr>
-        <w:t xml:space="preserve">– Level (уровень) — содержит информацию об уровне сложности и чекпоинтах;</w:t>
-      </w:r>
-    </w:p>
-    <w:p>
-      <w:pPr>
-        <w:spacing w:after="0" w:before="0" w:line="360"/>
-        <w:ind w:left="283" w:right="283" w:firstLine="708"/>
-        <w:jc w:val="both"/>
-      </w:pPr>
-      <w:r>
-        <w:rPr>
-          <w:rFonts w:ascii="Times New Roman" w:cs="Times New Roman" w:eastAsia="Times New Roman" w:hAnsi="Times New Roman"/>
-          <w:b w:val="false"/>
-          <w:bCs w:val="false"/>
-          <w:i w:val="false"/>
-          <w:iCs w:val="false"/>
-          <w:sz w:val="28"/>
-          <w:szCs w:val="28"/>
-        </w:rPr>
-        <w:t xml:space="preserve">– Checkpoint (чекпоинт) — отдельный модуль обучения в рамках уровня;</w:t>
-      </w:r>
-    </w:p>
-    <w:p>
-      <w:pPr>
-        <w:spacing w:after="0" w:before="0" w:line="360"/>
-        <w:ind w:left="283" w:right="283" w:firstLine="708"/>
-        <w:jc w:val="both"/>
-      </w:pPr>
-      <w:r>
-        <w:rPr>
-          <w:rFonts w:ascii="Times New Roman" w:cs="Times New Roman" w:eastAsia="Times New Roman" w:hAnsi="Times New Roman"/>
-          <w:b w:val="false"/>
-          <w:bCs w:val="false"/>
-          <w:i w:val="false"/>
-          <w:iCs w:val="false"/>
-          <w:sz w:val="28"/>
-          <w:szCs w:val="28"/>
-        </w:rPr>
-        <w:t xml:space="preserve">– Quiz (квиз) — набор вопросов для проверки знаний;</w:t>
-      </w:r>
-    </w:p>
-    <w:p>
-      <w:pPr>
-        <w:spacing w:after="0" w:before="0" w:line="360"/>
-        <w:ind w:left="283" w:right="283" w:firstLine="708"/>
-        <w:jc w:val="both"/>
-      </w:pPr>
-      <w:r>
-        <w:rPr>
-          <w:rFonts w:ascii="Times New Roman" w:cs="Times New Roman" w:eastAsia="Times New Roman" w:hAnsi="Times New Roman"/>
-          <w:b w:val="false"/>
-          <w:bCs w:val="false"/>
-          <w:i w:val="false"/>
-          <w:iCs w:val="false"/>
-          <w:sz w:val="28"/>
-          <w:szCs w:val="28"/>
-        </w:rPr>
-        <w:t xml:space="preserve">– Question (вопрос) — отдельный вопрос с вариантами ответов;</w:t>
-      </w:r>
-    </w:p>
-    <w:p>
-      <w:pPr>
-        <w:spacing w:after="0" w:before="0" w:line="360"/>
-        <w:ind w:left="283" w:right="283" w:firstLine="708"/>
-        <w:jc w:val="both"/>
-      </w:pPr>
-      <w:r>
-        <w:rPr>
-          <w:rFonts w:ascii="Times New Roman" w:cs="Times New Roman" w:eastAsia="Times New Roman" w:hAnsi="Times New Roman"/>
-          <w:b w:val="false"/>
-          <w:bCs w:val="false"/>
-          <w:i w:val="false"/>
-          <w:iCs w:val="false"/>
-          <w:sz w:val="28"/>
-          <w:szCs w:val="28"/>
-        </w:rPr>
-        <w:t xml:space="preserve">– Briefing (брифинг) — теоретический материал для Advanced уровней;</w:t>
-      </w:r>
-    </w:p>
-    <w:p>
-      <w:pPr>
-        <w:spacing w:after="0" w:before="0" w:line="360"/>
-        <w:ind w:left="283" w:right="283" w:firstLine="708"/>
-        <w:jc w:val="both"/>
-      </w:pPr>
-      <w:r>
-        <w:rPr>
-          <w:rFonts w:ascii="Times New Roman" w:cs="Times New Roman" w:eastAsia="Times New Roman" w:hAnsi="Times New Roman"/>
-          <w:b w:val="false"/>
-          <w:bCs w:val="false"/>
-          <w:i w:val="false"/>
-          <w:iCs w:val="false"/>
-          <w:sz w:val="28"/>
-          <w:szCs w:val="28"/>
-        </w:rPr>
-        <w:t xml:space="preserve">– UIConfig (конфигурация интерфейса) — настройки темы и стилей.</w:t>
-      </w:r>
-    </w:p>
-    <w:p>
-      <w:pPr>
-        <w:spacing w:after="0" w:before="0" w:line="360"/>
-        <w:ind w:left="283" w:right="283" w:firstLine="708"/>
-        <w:jc w:val="both"/>
-      </w:pPr>
-      <w:r>
-        <w:rPr>
-          <w:rFonts w:ascii="Times New Roman" w:cs="Times New Roman" w:eastAsia="Times New Roman" w:hAnsi="Times New Roman"/>
-          <w:b w:val="false"/>
-          <w:bCs w:val="false"/>
-          <w:i w:val="false"/>
-          <w:iCs w:val="false"/>
-          <w:sz w:val="28"/>
-          <w:szCs w:val="28"/>
-        </w:rPr>
-        <w:t xml:space="preserve">Логическая модель определяет структуру коллекций Firestore:</w:t>
+        <w:t xml:space="preserve">Проектирование базы данных выполнено в три этапа: концептуальное, логическое и физическое моделирование. В качестве СУБД используется Firebase Firestore — документо-ориентированная NoSQL база данных реального времени.</w:t>
+      </w:r>
+    </w:p>
+    <w:p>
+      <w:pPr>
+        <w:spacing w:after="0" w:before="0" w:line="360"/>
+        <w:ind w:left="283" w:right="283" w:firstLine="708"/>
+        <w:jc w:val="both"/>
+      </w:pPr>
+      <w:r>
+        <w:rPr>
+          <w:rFonts w:ascii="Times New Roman" w:cs="Times New Roman" w:eastAsia="Times New Roman" w:hAnsi="Times New Roman"/>
+          <w:b w:val="false"/>
+          <w:bCs w:val="false"/>
+          <w:i w:val="false"/>
+          <w:iCs w:val="false"/>
+          <w:sz w:val="28"/>
+          <w:szCs w:val="28"/>
+        </w:rPr>
+        <w:t xml:space="preserve">Концептуальная модель: Основные сущности предметной области: «Пользователь» (User) — хранит данные аутентификации и прогресс; «Чекпоинт» (Checkpoint) — учебный модуль с контентом; «Результат» (Result) — связь между пользователем и чекпоинтом с оценкой; «Уровень» (Level) — группа чекпоинтов по сложности; «Квиз» (Quiz) — вопросы для проверки знаний; «Брифинг» (Briefing) — теоретический материал; «Достижение» (Achievement) — награды пользователя.</w:t>
+      </w:r>
+    </w:p>
+    <w:p>
+      <w:pPr>
+        <w:spacing w:after="0" w:before="0" w:line="360"/>
+        <w:ind w:left="283" w:right="283" w:firstLine="708"/>
+        <w:jc w:val="both"/>
+      </w:pPr>
+      <w:r>
+        <w:rPr>
+          <w:rFonts w:ascii="Times New Roman" w:cs="Times New Roman" w:eastAsia="Times New Roman" w:hAnsi="Times New Roman"/>
+          <w:b w:val="false"/>
+          <w:bCs w:val="false"/>
+          <w:i w:val="false"/>
+          <w:iCs w:val="false"/>
+          <w:sz w:val="28"/>
+          <w:szCs w:val="28"/>
+        </w:rPr>
+        <w:t xml:space="preserve">Логическая модель: Структура коллекций Firestore:</w:t>
+      </w:r>
+    </w:p>
+    <w:p>
+      <w:pPr>
+        <w:spacing w:after="0" w:before="0" w:line="360"/>
+        <w:ind w:left="283" w:right="283" w:firstLine="708"/>
+        <w:jc w:val="both"/>
+      </w:pPr>
+      <w:r>
+        <w:rPr>
+          <w:rFonts w:ascii="Times New Roman" w:cs="Times New Roman" w:eastAsia="Times New Roman" w:hAnsi="Times New Roman"/>
+          <w:b w:val="false"/>
+          <w:bCs w:val="false"/>
+          <w:i w:val="false"/>
+          <w:iCs w:val="false"/>
+          <w:sz w:val="28"/>
+          <w:szCs w:val="28"/>
+        </w:rPr>
+        <w:t xml:space="preserve">– users/{userId} — документ пользователя: { displayName, email, createdAt, lastLoginAt, progress: { checkpointId: { score, total, attempts, completedAt } }, achievements: [...] };</w:t>
+      </w:r>
+    </w:p>
+    <w:p>
+      <w:pPr>
+        <w:spacing w:after="0" w:before="0" w:line="360"/>
+        <w:ind w:left="283" w:right="283" w:firstLine="708"/>
+        <w:jc w:val="both"/>
+      </w:pPr>
+      <w:r>
+        <w:rPr>
+          <w:rFonts w:ascii="Times New Roman" w:cs="Times New Roman" w:eastAsia="Times New Roman" w:hAnsi="Times New Roman"/>
+          <w:b w:val="false"/>
+          <w:bCs w:val="false"/>
+          <w:i w:val="false"/>
+          <w:iCs w:val="false"/>
+          <w:sz w:val="28"/>
+          <w:szCs w:val="28"/>
+        </w:rPr>
+        <w:t xml:space="preserve">– levels/{levelId} — документ уровня: { title, description, difficulty, order, checkpoints: [...] };</w:t>
+      </w:r>
+    </w:p>
+    <w:p>
+      <w:pPr>
+        <w:spacing w:after="0" w:before="0" w:line="360"/>
+        <w:ind w:left="283" w:right="283" w:firstLine="708"/>
+        <w:jc w:val="both"/>
+      </w:pPr>
+      <w:r>
+        <w:rPr>
+          <w:rFonts w:ascii="Times New Roman" w:cs="Times New Roman" w:eastAsia="Times New Roman" w:hAnsi="Times New Roman"/>
+          <w:b w:val="false"/>
+          <w:bCs w:val="false"/>
+          <w:i w:val="false"/>
+          <w:iCs w:val="false"/>
+          <w:sz w:val="28"/>
+          <w:szCs w:val="28"/>
+        </w:rPr>
+        <w:t xml:space="preserve">– checkpoints/{checkpointId} — документ чекпоинта: { title, levelId, order, simulation, quiz: [ { question, options, correctIndex } ], briefing };</w:t>
+      </w:r>
+    </w:p>
+    <w:p>
+      <w:pPr>
+        <w:spacing w:after="0" w:before="0" w:line="360"/>
+        <w:ind w:left="283" w:right="283" w:firstLine="708"/>
+        <w:jc w:val="both"/>
+      </w:pPr>
+      <w:r>
+        <w:rPr>
+          <w:rFonts w:ascii="Times New Roman" w:cs="Times New Roman" w:eastAsia="Times New Roman" w:hAnsi="Times New Roman"/>
+          <w:b w:val="false"/>
+          <w:bCs w:val="false"/>
+          <w:i w:val="false"/>
+          <w:iCs w:val="false"/>
+          <w:sz w:val="28"/>
+          <w:szCs w:val="28"/>
+        </w:rPr>
+        <w:t xml:space="preserve">– ui-config/{configId} — настройки интерфейса: { theme, title, logo }.</w:t>
+      </w:r>
+    </w:p>
+    <w:p>
+      <w:pPr>
+        <w:spacing w:after="0" w:before="0" w:line="360"/>
+        <w:ind w:left="283" w:right="283" w:firstLine="708"/>
+        <w:jc w:val="both"/>
+      </w:pPr>
+      <w:r>
+        <w:rPr>
+          <w:rFonts w:ascii="Times New Roman" w:cs="Times New Roman" w:eastAsia="Times New Roman" w:hAnsi="Times New Roman"/>
+          <w:b w:val="false"/>
+          <w:bCs w:val="false"/>
+          <w:i w:val="false"/>
+          <w:iCs w:val="false"/>
+          <w:sz w:val="28"/>
+          <w:szCs w:val="28"/>
+        </w:rPr>
+        <w:t xml:space="preserve">Таблица 2 — Структура коллекции users</w:t>
       </w:r>
     </w:p>
     <w:tbl>
@@ -5540,7 +5502,7 @@
                 <w:sz w:val="24"/>
                 <w:szCs w:val="24"/>
               </w:rPr>
-              <w:t xml:space="preserve">Коллекция</w:t>
+              <w:t xml:space="preserve">Поле</w:t>
             </w:r>
           </w:p>
         </w:tc>
@@ -5568,7 +5530,7 @@
                 <w:sz w:val="24"/>
                 <w:szCs w:val="24"/>
               </w:rPr>
-              <w:t xml:space="preserve">Поля</w:t>
+              <w:t xml:space="preserve">Тип</w:t>
             </w:r>
           </w:p>
         </w:tc>
@@ -5596,7 +5558,7 @@
                 <w:sz w:val="24"/>
                 <w:szCs w:val="24"/>
               </w:rPr>
-              <w:t xml:space="preserve">Тип данных</w:t>
+              <w:t xml:space="preserve">Описание</w:t>
             </w:r>
           </w:p>
         </w:tc>
@@ -5626,7 +5588,7 @@
                 <w:sz w:val="24"/>
                 <w:szCs w:val="24"/>
               </w:rPr>
-              <w:t xml:space="preserve">levels</w:t>
+              <w:t xml:space="preserve">uid</w:t>
             </w:r>
           </w:p>
         </w:tc>
@@ -5654,7 +5616,7 @@
                 <w:sz w:val="24"/>
                 <w:szCs w:val="24"/>
               </w:rPr>
-              <w:t xml:space="preserve">id, name, color, description, checkpoints</w:t>
+              <w:t xml:space="preserve">string</w:t>
             </w:r>
           </w:p>
         </w:tc>
@@ -5682,7 +5644,7 @@
                 <w:sz w:val="24"/>
                 <w:szCs w:val="24"/>
               </w:rPr>
-              <w:t xml:space="preserve">string, string, string, array</w:t>
+              <w:t xml:space="preserve">Идентификатор пользователя (Firebase UID)</w:t>
             </w:r>
           </w:p>
         </w:tc>
@@ -5712,7 +5674,7 @@
                 <w:sz w:val="24"/>
                 <w:szCs w:val="24"/>
               </w:rPr>
-              <w:t xml:space="preserve">quizzes</w:t>
+              <w:t xml:space="preserve">displayName</w:t>
             </w:r>
           </w:p>
         </w:tc>
@@ -5740,7 +5702,7 @@
                 <w:sz w:val="24"/>
                 <w:szCs w:val="24"/>
               </w:rPr>
-              <w:t xml:space="preserve">id, title, description, questions</w:t>
+              <w:t xml:space="preserve">string</w:t>
             </w:r>
           </w:p>
         </w:tc>
@@ -5768,7 +5730,7 @@
                 <w:sz w:val="24"/>
                 <w:szCs w:val="24"/>
               </w:rPr>
-              <w:t xml:space="preserve">string, string, string, array</w:t>
+              <w:t xml:space="preserve">Отображаемое имя</w:t>
             </w:r>
           </w:p>
         </w:tc>
@@ -5798,7 +5760,7 @@
                 <w:sz w:val="24"/>
                 <w:szCs w:val="24"/>
               </w:rPr>
-              <w:t xml:space="preserve">briefings</w:t>
+              <w:t xml:space="preserve">email</w:t>
             </w:r>
           </w:p>
         </w:tc>
@@ -5826,7 +5788,7 @@
                 <w:sz w:val="24"/>
                 <w:szCs w:val="24"/>
               </w:rPr>
-              <w:t xml:space="preserve">id, title, subtitle, icon, color, scenario, concepts, stages</w:t>
+              <w:t xml:space="preserve">string</w:t>
             </w:r>
           </w:p>
         </w:tc>
@@ -5854,7 +5816,7 @@
                 <w:sz w:val="24"/>
                 <w:szCs w:val="24"/>
               </w:rPr>
-              <w:t xml:space="preserve">string, string, string, string, string, object, array, array</w:t>
+              <w:t xml:space="preserve">Email (для зарегистрированных)</w:t>
             </w:r>
           </w:p>
         </w:tc>
@@ -5884,7 +5846,7 @@
                 <w:sz w:val="24"/>
                 <w:szCs w:val="24"/>
               </w:rPr>
-              <w:t xml:space="preserve">ui-config</w:t>
+              <w:t xml:space="preserve">createdAt</w:t>
             </w:r>
           </w:p>
         </w:tc>
@@ -5912,7 +5874,7 @@
                 <w:sz w:val="24"/>
                 <w:szCs w:val="24"/>
               </w:rPr>
-              <w:t xml:space="preserve">colors, fonts, theme, animations</w:t>
+              <w:t xml:space="preserve">timestamp</w:t>
             </w:r>
           </w:p>
         </w:tc>
@@ -5940,7 +5902,265 @@
                 <w:sz w:val="24"/>
                 <w:szCs w:val="24"/>
               </w:rPr>
-              <w:t xml:space="preserve">object, object, string, object</w:t>
+              <w:t xml:space="preserve">Дата создания аккаунта</w:t>
+            </w:r>
+          </w:p>
+        </w:tc>
+      </w:tr>
+      <w:tr>
+        <w:tc>
+          <w:tcPr>
+            <w:tcBorders>
+              <w:top w:val="single" w:color="000000" w:sz="1"/>
+              <w:left w:val="single" w:color="000000" w:sz="1"/>
+              <w:bottom w:val="single" w:color="000000" w:sz="1"/>
+              <w:right w:val="single" w:color="000000" w:sz="1"/>
+            </w:tcBorders>
+          </w:tcPr>
+          <w:p>
+            <w:pPr>
+              <w:spacing w:after="0" w:before="0" w:line="240"/>
+              <w:jc w:val="center"/>
+            </w:pPr>
+            <w:r>
+              <w:rPr>
+                <w:rFonts w:ascii="Times New Roman" w:cs="Times New Roman" w:eastAsia="Times New Roman" w:hAnsi="Times New Roman"/>
+                <w:b w:val="false"/>
+                <w:bCs w:val="false"/>
+                <w:i w:val="false"/>
+                <w:iCs w:val="false"/>
+                <w:sz w:val="24"/>
+                <w:szCs w:val="24"/>
+              </w:rPr>
+              <w:t xml:space="preserve">lastLoginAt</w:t>
+            </w:r>
+          </w:p>
+        </w:tc>
+        <w:tc>
+          <w:tcPr>
+            <w:tcBorders>
+              <w:top w:val="single" w:color="000000" w:sz="1"/>
+              <w:left w:val="single" w:color="000000" w:sz="1"/>
+              <w:bottom w:val="single" w:color="000000" w:sz="1"/>
+              <w:right w:val="single" w:color="000000" w:sz="1"/>
+            </w:tcBorders>
+          </w:tcPr>
+          <w:p>
+            <w:pPr>
+              <w:spacing w:after="0" w:before="0" w:line="240"/>
+              <w:jc w:val="center"/>
+            </w:pPr>
+            <w:r>
+              <w:rPr>
+                <w:rFonts w:ascii="Times New Roman" w:cs="Times New Roman" w:eastAsia="Times New Roman" w:hAnsi="Times New Roman"/>
+                <w:b w:val="false"/>
+                <w:bCs w:val="false"/>
+                <w:i w:val="false"/>
+                <w:iCs w:val="false"/>
+                <w:sz w:val="24"/>
+                <w:szCs w:val="24"/>
+              </w:rPr>
+              <w:t xml:space="preserve">timestamp</w:t>
+            </w:r>
+          </w:p>
+        </w:tc>
+        <w:tc>
+          <w:tcPr>
+            <w:tcBorders>
+              <w:top w:val="single" w:color="000000" w:sz="1"/>
+              <w:left w:val="single" w:color="000000" w:sz="1"/>
+              <w:bottom w:val="single" w:color="000000" w:sz="1"/>
+              <w:right w:val="single" w:color="000000" w:sz="1"/>
+            </w:tcBorders>
+          </w:tcPr>
+          <w:p>
+            <w:pPr>
+              <w:spacing w:after="0" w:before="0" w:line="240"/>
+              <w:jc w:val="center"/>
+            </w:pPr>
+            <w:r>
+              <w:rPr>
+                <w:rFonts w:ascii="Times New Roman" w:cs="Times New Roman" w:eastAsia="Times New Roman" w:hAnsi="Times New Roman"/>
+                <w:b w:val="false"/>
+                <w:bCs w:val="false"/>
+                <w:i w:val="false"/>
+                <w:iCs w:val="false"/>
+                <w:sz w:val="24"/>
+                <w:szCs w:val="24"/>
+              </w:rPr>
+              <w:t xml:space="preserve">Дата последнего входа</w:t>
+            </w:r>
+          </w:p>
+        </w:tc>
+      </w:tr>
+      <w:tr>
+        <w:tc>
+          <w:tcPr>
+            <w:tcBorders>
+              <w:top w:val="single" w:color="000000" w:sz="1"/>
+              <w:left w:val="single" w:color="000000" w:sz="1"/>
+              <w:bottom w:val="single" w:color="000000" w:sz="1"/>
+              <w:right w:val="single" w:color="000000" w:sz="1"/>
+            </w:tcBorders>
+          </w:tcPr>
+          <w:p>
+            <w:pPr>
+              <w:spacing w:after="0" w:before="0" w:line="240"/>
+              <w:jc w:val="center"/>
+            </w:pPr>
+            <w:r>
+              <w:rPr>
+                <w:rFonts w:ascii="Times New Roman" w:cs="Times New Roman" w:eastAsia="Times New Roman" w:hAnsi="Times New Roman"/>
+                <w:b w:val="false"/>
+                <w:bCs w:val="false"/>
+                <w:i w:val="false"/>
+                <w:iCs w:val="false"/>
+                <w:sz w:val="24"/>
+                <w:szCs w:val="24"/>
+              </w:rPr>
+              <w:t xml:space="preserve">progress</w:t>
+            </w:r>
+          </w:p>
+        </w:tc>
+        <w:tc>
+          <w:tcPr>
+            <w:tcBorders>
+              <w:top w:val="single" w:color="000000" w:sz="1"/>
+              <w:left w:val="single" w:color="000000" w:sz="1"/>
+              <w:bottom w:val="single" w:color="000000" w:sz="1"/>
+              <w:right w:val="single" w:color="000000" w:sz="1"/>
+            </w:tcBorders>
+          </w:tcPr>
+          <w:p>
+            <w:pPr>
+              <w:spacing w:after="0" w:before="0" w:line="240"/>
+              <w:jc w:val="center"/>
+            </w:pPr>
+            <w:r>
+              <w:rPr>
+                <w:rFonts w:ascii="Times New Roman" w:cs="Times New Roman" w:eastAsia="Times New Roman" w:hAnsi="Times New Roman"/>
+                <w:b w:val="false"/>
+                <w:bCs w:val="false"/>
+                <w:i w:val="false"/>
+                <w:iCs w:val="false"/>
+                <w:sz w:val="24"/>
+                <w:szCs w:val="24"/>
+              </w:rPr>
+              <w:t xml:space="preserve">map</w:t>
+            </w:r>
+          </w:p>
+        </w:tc>
+        <w:tc>
+          <w:tcPr>
+            <w:tcBorders>
+              <w:top w:val="single" w:color="000000" w:sz="1"/>
+              <w:left w:val="single" w:color="000000" w:sz="1"/>
+              <w:bottom w:val="single" w:color="000000" w:sz="1"/>
+              <w:right w:val="single" w:color="000000" w:sz="1"/>
+            </w:tcBorders>
+          </w:tcPr>
+          <w:p>
+            <w:pPr>
+              <w:spacing w:after="0" w:before="0" w:line="240"/>
+              <w:jc w:val="center"/>
+            </w:pPr>
+            <w:r>
+              <w:rPr>
+                <w:rFonts w:ascii="Times New Roman" w:cs="Times New Roman" w:eastAsia="Times New Roman" w:hAnsi="Times New Roman"/>
+                <w:b w:val="false"/>
+                <w:bCs w:val="false"/>
+                <w:i w:val="false"/>
+                <w:iCs w:val="false"/>
+                <w:sz w:val="24"/>
+                <w:szCs w:val="24"/>
+              </w:rPr>
+              <w:t xml:space="preserve">Карта прогресса по чекпоинтам</w:t>
+            </w:r>
+          </w:p>
+        </w:tc>
+      </w:tr>
+      <w:tr>
+        <w:tc>
+          <w:tcPr>
+            <w:tcBorders>
+              <w:top w:val="single" w:color="000000" w:sz="1"/>
+              <w:left w:val="single" w:color="000000" w:sz="1"/>
+              <w:bottom w:val="single" w:color="000000" w:sz="1"/>
+              <w:right w:val="single" w:color="000000" w:sz="1"/>
+            </w:tcBorders>
+          </w:tcPr>
+          <w:p>
+            <w:pPr>
+              <w:spacing w:after="0" w:before="0" w:line="240"/>
+              <w:jc w:val="center"/>
+            </w:pPr>
+            <w:r>
+              <w:rPr>
+                <w:rFonts w:ascii="Times New Roman" w:cs="Times New Roman" w:eastAsia="Times New Roman" w:hAnsi="Times New Roman"/>
+                <w:b w:val="false"/>
+                <w:bCs w:val="false"/>
+                <w:i w:val="false"/>
+                <w:iCs w:val="false"/>
+                <w:sz w:val="24"/>
+                <w:szCs w:val="24"/>
+              </w:rPr>
+              <w:t xml:space="preserve">achievements</w:t>
+            </w:r>
+          </w:p>
+        </w:tc>
+        <w:tc>
+          <w:tcPr>
+            <w:tcBorders>
+              <w:top w:val="single" w:color="000000" w:sz="1"/>
+              <w:left w:val="single" w:color="000000" w:sz="1"/>
+              <w:bottom w:val="single" w:color="000000" w:sz="1"/>
+              <w:right w:val="single" w:color="000000" w:sz="1"/>
+            </w:tcBorders>
+          </w:tcPr>
+          <w:p>
+            <w:pPr>
+              <w:spacing w:after="0" w:before="0" w:line="240"/>
+              <w:jc w:val="center"/>
+            </w:pPr>
+            <w:r>
+              <w:rPr>
+                <w:rFonts w:ascii="Times New Roman" w:cs="Times New Roman" w:eastAsia="Times New Roman" w:hAnsi="Times New Roman"/>
+                <w:b w:val="false"/>
+                <w:bCs w:val="false"/>
+                <w:i w:val="false"/>
+                <w:iCs w:val="false"/>
+                <w:sz w:val="24"/>
+                <w:szCs w:val="24"/>
+              </w:rPr>
+              <w:t xml:space="preserve">array</w:t>
+            </w:r>
+          </w:p>
+        </w:tc>
+        <w:tc>
+          <w:tcPr>
+            <w:tcBorders>
+              <w:top w:val="single" w:color="000000" w:sz="1"/>
+              <w:left w:val="single" w:color="000000" w:sz="1"/>
+              <w:bottom w:val="single" w:color="000000" w:sz="1"/>
+              <w:right w:val="single" w:color="000000" w:sz="1"/>
+            </w:tcBorders>
+          </w:tcPr>
+          <w:p>
+            <w:pPr>
+              <w:spacing w:after="0" w:before="0" w:line="240"/>
+              <w:jc w:val="center"/>
+            </w:pPr>
+            <w:r>
+              <w:rPr>
+                <w:rFonts w:ascii="Times New Roman" w:cs="Times New Roman" w:eastAsia="Times New Roman" w:hAnsi="Times New Roman"/>
+                <w:b w:val="false"/>
+                <w:bCs w:val="false"/>
+                <w:i w:val="false"/>
+                <w:iCs w:val="false"/>
+                <w:sz w:val="24"/>
+                <w:szCs w:val="24"/>
+              </w:rPr>
+              <w:t xml:space="preserve">Массив полученных достижений</w:t>
             </w:r>
           </w:p>
         </w:tc>
@@ -5962,102 +6182,7 @@
           <w:sz w:val="28"/>
           <w:szCs w:val="28"/>
         </w:rPr>
-        <w:t xml:space="preserve">Физическая модель реализована в Firebase Firestore со следующей структурой:</w:t>
-      </w:r>
-    </w:p>
-    <w:p>
-      <w:pPr>
-        <w:spacing w:after="0" w:before="0" w:line="360"/>
-        <w:ind w:left="283" w:right="283" w:firstLine="708"/>
-        <w:jc w:val="both"/>
-      </w:pPr>
-      <w:r>
-        <w:rPr>
-          <w:rFonts w:ascii="Times New Roman" w:cs="Times New Roman" w:eastAsia="Times New Roman" w:hAnsi="Times New Roman"/>
-          <w:b w:val="false"/>
-          <w:bCs w:val="false"/>
-          <w:i w:val="false"/>
-          <w:iCs w:val="false"/>
-          <w:sz w:val="28"/>
-          <w:szCs w:val="28"/>
-        </w:rPr>
-        <w:t xml:space="preserve">Коллекция «levels» содержит 3 документа: beginner, intermediate, advanced. Каждый документ включает массив checkpoints с объектами simulation, theory и quiz.</w:t>
-      </w:r>
-    </w:p>
-    <w:p>
-      <w:pPr>
-        <w:spacing w:after="0" w:before="0" w:line="360"/>
-        <w:ind w:left="283" w:right="283" w:firstLine="708"/>
-        <w:jc w:val="both"/>
-      </w:pPr>
-      <w:r>
-        <w:rPr>
-          <w:rFonts w:ascii="Times New Roman" w:cs="Times New Roman" w:eastAsia="Times New Roman" w:hAnsi="Times New Roman"/>
-          <w:b w:val="false"/>
-          <w:bCs w:val="false"/>
-          <w:i w:val="false"/>
-          <w:iCs w:val="false"/>
-          <w:sz w:val="28"/>
-          <w:szCs w:val="28"/>
-        </w:rPr>
-        <w:t xml:space="preserve">Коллекция «quizzes» содержит 14 документов, каждый из которых представляет отдельный квиз с массивом вопросов.</w:t>
-      </w:r>
-    </w:p>
-    <w:p>
-      <w:pPr>
-        <w:spacing w:after="0" w:before="0" w:line="360"/>
-        <w:ind w:left="283" w:right="283" w:firstLine="708"/>
-        <w:jc w:val="both"/>
-      </w:pPr>
-      <w:r>
-        <w:rPr>
-          <w:rFonts w:ascii="Times New Roman" w:cs="Times New Roman" w:eastAsia="Times New Roman" w:hAnsi="Times New Roman"/>
-          <w:b w:val="false"/>
-          <w:bCs w:val="false"/>
-          <w:i w:val="false"/>
-          <w:iCs w:val="false"/>
-          <w:sz w:val="28"/>
-          <w:szCs w:val="28"/>
-        </w:rPr>
-        <w:t xml:space="preserve">Коллекция «briefings» содержит 4 документа для Advanced уровней: ddos, pentest, incident-response, osint.</w:t>
-      </w:r>
-    </w:p>
-    <w:p>
-      <w:pPr>
-        <w:spacing w:after="0" w:before="0" w:line="360"/>
-        <w:ind w:left="283" w:right="283" w:firstLine="708"/>
-        <w:jc w:val="both"/>
-      </w:pPr>
-      <w:r>
-        <w:rPr>
-          <w:rFonts w:ascii="Times New Roman" w:cs="Times New Roman" w:eastAsia="Times New Roman" w:hAnsi="Times New Roman"/>
-          <w:b w:val="false"/>
-          <w:bCs w:val="false"/>
-          <w:i w:val="false"/>
-          <w:iCs w:val="false"/>
-          <w:sz w:val="28"/>
-          <w:szCs w:val="28"/>
-        </w:rPr>
-        <w:t xml:space="preserve">Коллекция «ui-config» содержит 1 документ global с настройками цветовой схемы и анимаций.</w:t>
-      </w:r>
-    </w:p>
-    <w:p>
-      <w:pPr>
-        <w:spacing w:after="0" w:before="0" w:line="360"/>
-        <w:ind w:left="283" w:right="283" w:firstLine="708"/>
-        <w:jc w:val="both"/>
-      </w:pPr>
-      <w:r>
-        <w:rPr>
-          <w:rFonts w:ascii="Times New Roman" w:cs="Times New Roman" w:eastAsia="Times New Roman" w:hAnsi="Times New Roman"/>
-          <w:b w:val="false"/>
-          <w:bCs w:val="false"/>
-          <w:i w:val="false"/>
-          <w:iCs w:val="false"/>
-          <w:sz w:val="28"/>
-          <w:szCs w:val="28"/>
-        </w:rPr>
-        <w:t xml:space="preserve">Индексы: Firestore автоматически создаёт индексы для полей, используемых в запросах. Для коллекции quizzes создан составной индекс по полям title и questions.length для оптимизации поиска.</w:t>
+        <w:t xml:space="preserve">Физическая модель: База данных развёрнута в проекте Firebase cybersecurity-platform-c6bfc. Регион размещения данных — us-central1. Правила безопасности Firestore настроены на разграничение доступа: чтение и запись своих данных разрешены только аутентифицированному пользователю по UID; административные данные доступны только администратору.</w:t>
       </w:r>
     </w:p>
     <w:p>
@@ -11093,7 +11218,83 @@
           <w:sz w:val="28"/>
           <w:szCs w:val="28"/>
         </w:rPr>
-        <w:t xml:space="preserve">Регистрация новых пользователей отключена в настройках Firebase Console. Добавление новых администраторов осуществляется вручную через Firebase Console или с помощью Firebase Admin SDK.</w:t>
+        <w:t xml:space="preserve">Регистрация новых пользователей осуществляется через форму регистрации с указанием имени, email и пароля. После успешной регистрации система автоматически отправляет на указанный email письмо для подтверждения адреса электронной почты. Подтверждение email реализовано через встроенный механизм Firebase Authentication (метод sendEmailVerification).</w:t>
+      </w:r>
+    </w:p>
+    <w:p>
+      <w:pPr>
+        <w:spacing w:after="0" w:before="0" w:line="360"/>
+        <w:ind w:left="283" w:right="283" w:firstLine="708"/>
+        <w:jc w:val="both"/>
+      </w:pPr>
+      <w:r>
+        <w:rPr>
+          <w:rFonts w:ascii="Times New Roman" w:cs="Times New Roman" w:eastAsia="Times New Roman" w:hAnsi="Times New Roman"/>
+          <w:b w:val="false"/>
+          <w:bCs w:val="false"/>
+          <w:i w:val="false"/>
+          <w:iCs w:val="false"/>
+          <w:sz w:val="28"/>
+          <w:szCs w:val="28"/>
+        </w:rPr>
+        <w:t xml:space="preserve">Функция сброса пароля доступна в двух вариантах:</w:t>
+      </w:r>
+    </w:p>
+    <w:p>
+      <w:pPr>
+        <w:spacing w:after="0" w:before="0" w:line="360"/>
+        <w:ind w:left="283" w:right="283" w:firstLine="708"/>
+        <w:jc w:val="both"/>
+      </w:pPr>
+      <w:r>
+        <w:rPr>
+          <w:rFonts w:ascii="Times New Roman" w:cs="Times New Roman" w:eastAsia="Times New Roman" w:hAnsi="Times New Roman"/>
+          <w:b w:val="false"/>
+          <w:bCs w:val="false"/>
+          <w:i w:val="false"/>
+          <w:iCs w:val="false"/>
+          <w:sz w:val="28"/>
+          <w:szCs w:val="28"/>
+        </w:rPr>
+        <w:t xml:space="preserve">– самостоятельный сброс — пользователь нажимает ссылку «Забыли пароль?» на форме входа, вводит email и получает ссылку для установки нового пароля;</w:t>
+      </w:r>
+    </w:p>
+    <w:p>
+      <w:pPr>
+        <w:spacing w:after="0" w:before="0" w:line="360"/>
+        <w:ind w:left="283" w:right="283" w:firstLine="708"/>
+        <w:jc w:val="both"/>
+      </w:pPr>
+      <w:r>
+        <w:rPr>
+          <w:rFonts w:ascii="Times New Roman" w:cs="Times New Roman" w:eastAsia="Times New Roman" w:hAnsi="Times New Roman"/>
+          <w:b w:val="false"/>
+          <w:bCs w:val="false"/>
+          <w:i w:val="false"/>
+          <w:iCs w:val="false"/>
+          <w:sz w:val="28"/>
+          <w:szCs w:val="28"/>
+        </w:rPr>
+        <w:t xml:space="preserve">– сброс через администратора — администратор вводит email пользователя в разделе «Пользователи» административной панели и инициирует отправку ссылки сброса пароля.</w:t>
+      </w:r>
+    </w:p>
+    <w:p>
+      <w:pPr>
+        <w:spacing w:after="0" w:before="0" w:line="360"/>
+        <w:ind w:left="283" w:right="283" w:firstLine="708"/>
+        <w:jc w:val="both"/>
+      </w:pPr>
+      <w:r>
+        <w:rPr>
+          <w:rFonts w:ascii="Times New Roman" w:cs="Times New Roman" w:eastAsia="Times New Roman" w:hAnsi="Times New Roman"/>
+          <w:b w:val="false"/>
+          <w:bCs w:val="false"/>
+          <w:i w:val="false"/>
+          <w:iCs w:val="false"/>
+          <w:sz w:val="28"/>
+          <w:szCs w:val="28"/>
+        </w:rPr>
+        <w:t xml:space="preserve">В обоих случаях используется метод sendPasswordResetEmail Firebase Authentication. Ссылка для сброса пароля действительна в течение 1 часа. Администратор не имеет возможности просматривать или устанавливать пароль пользователя напрямую — это обеспечивает безопасность аккаунтов.</w:t>
       </w:r>
     </w:p>
     <w:p>

</xml_diff>